<commit_message>
Composition Concepts: add reflection download to overview + update questions
The reflection doc existed but was never linked, so students could not download it.
Adds the EN/ES reflection download to the module overview (resources live on the
overview). Updates the questions to the individual set: which 3 concepts you chose,
which you enjoyed most or found easiest, which was hardest, and what you would do
differently next time.

Co-Authored-By: Claude Opus 4.8 <noreply@anthropic.com>
</commit_message>
<xml_diff>
--- a/assets/course-documents/Composition-Concepts-Reflection-EN.docx
+++ b/assets/course-documents/Composition-Concepts-Reflection-EN.docx
@@ -206,7 +206,7 @@
                 <w:sz w:val="23"/>
                 <w:szCs w:val="23"/>
               </w:rPr>
-              <w:t xml:space="preserve">What are the 3 composition concepts you chose?</w:t>
+              <w:t xml:space="preserve">Which 3 composition concepts did you choose?</w:t>
             </w:r>
           </w:p>
         </w:tc>
@@ -326,7 +326,7 @@
                 <w:sz w:val="23"/>
                 <w:szCs w:val="23"/>
               </w:rPr>
-              <w:t xml:space="preserve">For each of your 3 photos, describe how you showed the concept.</w:t>
+              <w:t xml:space="preserve">Which one did you enjoy the most, or find easiest to execute? Why?</w:t>
             </w:r>
           </w:p>
         </w:tc>
@@ -446,7 +446,7 @@
                 <w:sz w:val="23"/>
                 <w:szCs w:val="23"/>
               </w:rPr>
-              <w:t xml:space="preserve">Which concept was the hardest to capture? Why?</w:t>
+              <w:t xml:space="preserve">Which one was the hardest? Why?</w:t>
             </w:r>
           </w:p>
         </w:tc>
@@ -566,7 +566,7 @@
                 <w:sz w:val="23"/>
                 <w:szCs w:val="23"/>
               </w:rPr>
-              <w:t xml:space="preserve">Which photo is your favorite? Why?</w:t>
+              <w:t xml:space="preserve">What would you do differently next time?</w:t>
             </w:r>
           </w:p>
         </w:tc>
@@ -638,126 +638,6 @@
         <w:t xml:space="preserve"/>
       </w:r>
     </w:p>
-    <w:tbl>
-      <w:tblPr>
-        <w:tblW w:type="dxa" w:w="10800"/>
-        <w:tblBorders>
-          <w:top w:val="none"/>
-          <w:left w:val="none"/>
-          <w:bottom w:val="none"/>
-          <w:right w:val="none"/>
-          <w:insideH w:val="single" w:color="auto" w:sz="4"/>
-          <w:insideV w:val="single" w:color="auto" w:sz="4"/>
-        </w:tblBorders>
-      </w:tblPr>
-      <w:tblGrid>
-        <w:gridCol w:w="10800"/>
-      </w:tblGrid>
-      <w:tr>
-        <w:tc>
-          <w:tcPr>
-            <w:tcW w:type="dxa" w:w="10800"/>
-            <w:shd w:fill="007474" w:val="clear"/>
-            <w:tcMar>
-              <w:top w:type="dxa" w:w="70"/>
-              <w:left w:type="dxa" w:w="160"/>
-              <w:bottom w:type="dxa" w:w="70"/>
-              <w:right w:type="dxa" w:w="160"/>
-            </w:tcMar>
-          </w:tcPr>
-          <w:p>
-            <w:r>
-              <w:rPr>
-                <w:rFonts w:ascii="Arial" w:cs="Arial" w:eastAsia="Arial" w:hAnsi="Arial"/>
-                <w:b/>
-                <w:bCs/>
-                <w:color w:val="FFFFFF"/>
-                <w:sz w:val="23"/>
-                <w:szCs w:val="23"/>
-              </w:rPr>
-              <w:t xml:space="preserve">5.  </w:t>
-            </w:r>
-            <w:r>
-              <w:rPr>
-                <w:rFonts w:ascii="Arial" w:cs="Arial" w:eastAsia="Arial" w:hAnsi="Arial"/>
-                <w:b/>
-                <w:bCs/>
-                <w:color w:val="FFFFFF"/>
-                <w:sz w:val="23"/>
-                <w:szCs w:val="23"/>
-              </w:rPr>
-              <w:t xml:space="preserve">What did you learn about composition from this project?</w:t>
-            </w:r>
-          </w:p>
-        </w:tc>
-      </w:tr>
-    </w:tbl>
-    <w:p>
-      <w:pPr>
-        <w:spacing w:after="60"/>
-      </w:pPr>
-      <w:r>
-        <w:t xml:space="preserve"/>
-      </w:r>
-    </w:p>
-    <w:tbl>
-      <w:tblPr>
-        <w:tblW w:type="dxa" w:w="10800"/>
-        <w:tblBorders>
-          <w:top w:val="single" w:color="auto" w:sz="4"/>
-          <w:left w:val="single" w:color="auto" w:sz="4"/>
-          <w:bottom w:val="single" w:color="auto" w:sz="4"/>
-          <w:right w:val="single" w:color="auto" w:sz="4"/>
-          <w:insideH w:val="single" w:color="auto" w:sz="4"/>
-          <w:insideV w:val="single" w:color="auto" w:sz="4"/>
-        </w:tblBorders>
-      </w:tblPr>
-      <w:tblGrid>
-        <w:gridCol w:w="10800"/>
-      </w:tblGrid>
-      <w:tr>
-        <w:trPr>
-          <w:trHeight w:val="1500" w:hRule="atLeast"/>
-        </w:trPr>
-        <w:tc>
-          <w:tcPr>
-            <w:tcW w:type="dxa" w:w="10800"/>
-            <w:tcBorders>
-              <w:top w:val="single" w:color="C4C4C4" w:sz="8"/>
-              <w:left w:val="single" w:color="C4C4C4" w:sz="8"/>
-              <w:bottom w:val="single" w:color="C4C4C4" w:sz="8"/>
-              <w:right w:val="single" w:color="C4C4C4" w:sz="8"/>
-            </w:tcBorders>
-            <w:tcMar>
-              <w:top w:type="dxa" w:w="100"/>
-              <w:left w:type="dxa" w:w="160"/>
-              <w:bottom w:type="dxa" w:w="100"/>
-              <w:right w:type="dxa" w:w="160"/>
-            </w:tcMar>
-          </w:tcPr>
-          <w:p>
-            <w:r>
-              <w:rPr>
-                <w:i/>
-                <w:iCs/>
-                <w:color w:val="8A8A8A"/>
-                <w:sz w:val="22"/>
-                <w:szCs w:val="22"/>
-              </w:rPr>
-              <w:t xml:space="preserve">Type your answer here.</w:t>
-            </w:r>
-          </w:p>
-        </w:tc>
-      </w:tr>
-    </w:tbl>
-    <w:p>
-      <w:pPr>
-        <w:spacing w:after="160"/>
-      </w:pPr>
-      <w:r>
-        <w:t xml:space="preserve"/>
-      </w:r>
-    </w:p>
     <w:sectPr>
       <w:pgSz w:w="12240" w:h="15840" w:orient="portrait"/>
       <w:pgMar w:top="900" w:right="720" w:bottom="900" w:left="720" w:header="708" w:footer="708" w:gutter="0"/>

</xml_diff>